<commit_message>
agrego diagrama de modulos
</commit_message>
<xml_diff>
--- a/NostalgiaHub_Sprint 0.docx
+++ b/NostalgiaHub_Sprint 0.docx
@@ -230,10 +230,12 @@
                                   <w:pPr>
                                     <w:pStyle w:val="Ttulo"/>
                                     <w:spacing w:after="0"/>
+                                    <w:jc w:val="center"/>
                                     <w:rPr>
                                       <w:lang w:bidi="es-ES"/>
                                     </w:rPr>
                                   </w:pPr>
+                                  <w:proofErr w:type="spellStart"/>
                                   <w:r>
                                     <w:rPr>
                                       <w:lang w:bidi="es-ES"/>
@@ -246,6 +248,29 @@
                                     </w:rPr>
                                     <w:t>ostalgiaHub</w:t>
                                   </w:r>
+                                  <w:proofErr w:type="spellEnd"/>
+                                </w:p>
+                                <w:p>
+                                  <w:pPr>
+                                    <w:pStyle w:val="Ttulo"/>
+                                    <w:spacing w:after="0"/>
+                                    <w:rPr>
+                                      <w:sz w:val="22"/>
+                                      <w:szCs w:val="22"/>
+                                      <w:lang w:bidi="es-ES"/>
+                                    </w:rPr>
+                                  </w:pPr>
+                                </w:p>
+                                <w:p>
+                                  <w:pPr>
+                                    <w:pStyle w:val="Ttulo"/>
+                                    <w:spacing w:after="0"/>
+                                    <w:rPr>
+                                      <w:sz w:val="22"/>
+                                      <w:szCs w:val="22"/>
+                                      <w:lang w:bidi="es-ES"/>
+                                    </w:rPr>
+                                  </w:pPr>
                                 </w:p>
                                 <w:p>
                                   <w:pPr>
@@ -286,10 +311,12 @@
                             <w:pPr>
                               <w:pStyle w:val="Ttulo"/>
                               <w:spacing w:after="0"/>
+                              <w:jc w:val="center"/>
                               <w:rPr>
                                 <w:lang w:bidi="es-ES"/>
                               </w:rPr>
                             </w:pPr>
+                            <w:proofErr w:type="spellStart"/>
                             <w:r>
                               <w:rPr>
                                 <w:lang w:bidi="es-ES"/>
@@ -302,6 +329,29 @@
                               </w:rPr>
                               <w:t>ostalgiaHub</w:t>
                             </w:r>
+                            <w:proofErr w:type="spellEnd"/>
+                          </w:p>
+                          <w:p>
+                            <w:pPr>
+                              <w:pStyle w:val="Ttulo"/>
+                              <w:spacing w:after="0"/>
+                              <w:rPr>
+                                <w:sz w:val="22"/>
+                                <w:szCs w:val="22"/>
+                                <w:lang w:bidi="es-ES"/>
+                              </w:rPr>
+                            </w:pPr>
+                          </w:p>
+                          <w:p>
+                            <w:pPr>
+                              <w:pStyle w:val="Ttulo"/>
+                              <w:spacing w:after="0"/>
+                              <w:rPr>
+                                <w:sz w:val="22"/>
+                                <w:szCs w:val="22"/>
+                                <w:lang w:bidi="es-ES"/>
+                              </w:rPr>
+                            </w:pPr>
                           </w:p>
                           <w:p>
                             <w:pPr>
@@ -484,7 +534,7 @@
                     <w:noProof/>
                     <w:lang w:bidi="es-ES"/>
                   </w:rPr>
-                  <w:t>22 marzo</w:t>
+                  <w:t>25 marzo</w:t>
                 </w:r>
                 <w:r>
                   <w:rPr>
@@ -665,36 +715,45 @@
           <w:lang w:bidi="es-ES"/>
         </w:rPr>
         <w:drawing>
-          <wp:anchor distT="0" distB="0" distL="114300" distR="114300" simplePos="0" relativeHeight="251661312" behindDoc="0" locked="0" layoutInCell="1" allowOverlap="1" wp14:anchorId="479084CC" wp14:editId="0E4366D8">
+          <wp:anchor distT="0" distB="0" distL="114300" distR="114300" simplePos="0" relativeHeight="251662336" behindDoc="1" locked="0" layoutInCell="1" allowOverlap="1" wp14:anchorId="2283F6F1" wp14:editId="41DBBBBC">
             <wp:simplePos x="0" y="0"/>
             <wp:positionH relativeFrom="column">
-              <wp:posOffset>4949190</wp:posOffset>
+              <wp:posOffset>5187315</wp:posOffset>
             </wp:positionH>
             <wp:positionV relativeFrom="paragraph">
-              <wp:posOffset>7833359</wp:posOffset>
+              <wp:posOffset>7033260</wp:posOffset>
             </wp:positionV>
-            <wp:extent cx="1786904" cy="561975"/>
-            <wp:effectExtent l="0" t="0" r="0" b="0"/>
-            <wp:wrapNone/>
-            <wp:docPr id="12" name="Gráfico 201" descr="marcador-de-posición-de-logotipo">
-              <a:extLst xmlns:a="http://schemas.openxmlformats.org/drawingml/2006/main">
-                <a:ext uri="{FF2B5EF4-FFF2-40B4-BE49-F238E27FC236}">
-                  <a16:creationId xmlns:a16="http://schemas.microsoft.com/office/drawing/2014/main" id="{F3D65186-AB5A-4584-87C3-0FAA2992263B}"/>
-                </a:ext>
-              </a:extLst>
-            </wp:docPr>
-            <wp:cNvGraphicFramePr/>
+            <wp:extent cx="1057275" cy="1057275"/>
+            <wp:effectExtent l="0" t="0" r="9525" b="9525"/>
+            <wp:wrapTight wrapText="bothSides">
+              <wp:wrapPolygon edited="0">
+                <wp:start x="7395" y="0"/>
+                <wp:lineTo x="4670" y="1168"/>
+                <wp:lineTo x="0" y="5059"/>
+                <wp:lineTo x="0" y="14789"/>
+                <wp:lineTo x="2335" y="18681"/>
+                <wp:lineTo x="2335" y="19070"/>
+                <wp:lineTo x="6616" y="21405"/>
+                <wp:lineTo x="7395" y="21405"/>
+                <wp:lineTo x="14400" y="21405"/>
+                <wp:lineTo x="15178" y="21405"/>
+                <wp:lineTo x="19070" y="18681"/>
+                <wp:lineTo x="21405" y="14789"/>
+                <wp:lineTo x="21405" y="5059"/>
+                <wp:lineTo x="17514" y="1557"/>
+                <wp:lineTo x="14011" y="0"/>
+                <wp:lineTo x="7395" y="0"/>
+              </wp:wrapPolygon>
+            </wp:wrapTight>
+            <wp:docPr id="7" name="Imagen 7"/>
+            <wp:cNvGraphicFramePr>
+              <a:graphicFrameLocks xmlns:a="http://schemas.openxmlformats.org/drawingml/2006/main" noChangeAspect="1"/>
+            </wp:cNvGraphicFramePr>
             <a:graphic xmlns:a="http://schemas.openxmlformats.org/drawingml/2006/main">
               <a:graphicData uri="http://schemas.openxmlformats.org/drawingml/2006/picture">
                 <pic:pic xmlns:pic="http://schemas.openxmlformats.org/drawingml/2006/picture">
                   <pic:nvPicPr>
-                    <pic:cNvPr id="12" name="Gráfico 201" descr="marcador-de-posición-de-logotipo">
-                      <a:extLst>
-                        <a:ext uri="{FF2B5EF4-FFF2-40B4-BE49-F238E27FC236}">
-                          <a16:creationId xmlns:a16="http://schemas.microsoft.com/office/drawing/2014/main" id="{F3D65186-AB5A-4584-87C3-0FAA2992263B}"/>
-                        </a:ext>
-                      </a:extLst>
-                    </pic:cNvPr>
+                    <pic:cNvPr id="7" name="Imagen 7"/>
                     <pic:cNvPicPr/>
                   </pic:nvPicPr>
                   <pic:blipFill>
@@ -712,21 +771,15 @@
                   <pic:spPr>
                     <a:xfrm>
                       <a:off x="0" y="0"/>
-                      <a:ext cx="1803303" cy="567132"/>
+                      <a:ext cx="1057275" cy="1057275"/>
                     </a:xfrm>
-                    <a:prstGeom prst="rect">
+                    <a:prstGeom prst="ellipse">
                       <a:avLst/>
                     </a:prstGeom>
                   </pic:spPr>
                 </pic:pic>
               </a:graphicData>
             </a:graphic>
-            <wp14:sizeRelH relativeFrom="margin">
-              <wp14:pctWidth>0</wp14:pctWidth>
-            </wp14:sizeRelH>
-            <wp14:sizeRelV relativeFrom="margin">
-              <wp14:pctHeight>0</wp14:pctHeight>
-            </wp14:sizeRelV>
           </wp:anchor>
         </w:drawing>
       </w:r>
@@ -738,7 +791,7 @@
         <mc:AlternateContent>
           <mc:Choice Requires="wps">
             <w:drawing>
-              <wp:anchor distT="0" distB="0" distL="114300" distR="114300" simplePos="0" relativeHeight="251659264" behindDoc="1" locked="0" layoutInCell="1" allowOverlap="1" wp14:anchorId="4ACD330D" wp14:editId="3D2C579C">
+              <wp:anchor distT="0" distB="0" distL="114300" distR="114300" simplePos="0" relativeHeight="251659264" behindDoc="1" locked="0" layoutInCell="1" allowOverlap="1" wp14:anchorId="4ACD330D" wp14:editId="38F8493C">
                 <wp:simplePos x="0" y="0"/>
                 <wp:positionH relativeFrom="column">
                   <wp:posOffset>-745490</wp:posOffset>
@@ -801,9 +854,9 @@
               </wp:anchor>
             </w:drawing>
           </mc:Choice>
-          <mc:Fallback xmlns:oel="http://schemas.microsoft.com/office/2019/extlst">
+          <mc:Fallback>
             <w:pict>
-              <v:rect w14:anchorId="5A3CD8EB" id="Rectángulo 2" o:spid="_x0000_s1026" alt="rectángulo de color" style="position:absolute;margin-left:-58.7pt;margin-top:525pt;width:611.1pt;height:316.5pt;z-index:-251657216;visibility:visible;mso-wrap-style:square;mso-height-percent:0;mso-wrap-distance-left:9pt;mso-wrap-distance-top:0;mso-wrap-distance-right:9pt;mso-wrap-distance-bottom:0;mso-position-horizontal:absolute;mso-position-horizontal-relative:text;mso-position-vertical:absolute;mso-position-vertical-relative:page;mso-height-percent:0;mso-height-relative:margin;v-text-anchor:middle" o:gfxdata="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" fillcolor="#34aba2 [3206]" stroked="f" strokeweight="2pt">
+              <v:rect w14:anchorId="2CCD49BC" id="Rectángulo 2" o:spid="_x0000_s1026" alt="rectángulo de color" style="position:absolute;margin-left:-58.7pt;margin-top:525pt;width:611.1pt;height:316.5pt;z-index:-251657216;visibility:visible;mso-wrap-style:square;mso-height-percent:0;mso-wrap-distance-left:9pt;mso-wrap-distance-top:0;mso-wrap-distance-right:9pt;mso-wrap-distance-bottom:0;mso-position-horizontal:absolute;mso-position-horizontal-relative:text;mso-position-vertical:absolute;mso-position-vertical-relative:page;mso-height-percent:0;mso-height-relative:margin;v-text-anchor:middle" o:gfxdata="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" fillcolor="#34aba2 [3206]" stroked="f" strokeweight="2pt">
                 <w10:wrap anchory="page"/>
               </v:rect>
             </w:pict>
@@ -865,7 +918,15 @@
           <w:noProof/>
           <w:lang w:bidi="es-ES"/>
         </w:rPr>
-        <w:t xml:space="preserve"> web</w:t>
+        <w:t xml:space="preserve"> </w:t>
+      </w:r>
+      <w:r>
+        <w:rPr>
+          <w:bCs/>
+          <w:noProof/>
+          <w:lang w:bidi="es-ES"/>
+        </w:rPr>
+        <w:t>de escritorio con interfaz grafica</w:t>
       </w:r>
       <w:r>
         <w:rPr>
@@ -983,7 +1044,23 @@
           <w:bCs/>
           <w:szCs w:val="28"/>
         </w:rPr>
-        <w:t>Visualizar las categorias y los elementos registrados</w:t>
+        <w:t xml:space="preserve">Visualizar las </w:t>
+      </w:r>
+      <w:r>
+        <w:rPr>
+          <w:rFonts w:cstheme="minorHAnsi"/>
+          <w:bCs/>
+          <w:szCs w:val="28"/>
+        </w:rPr>
+        <w:t>categorías</w:t>
+      </w:r>
+      <w:r>
+        <w:rPr>
+          <w:rFonts w:cstheme="minorHAnsi"/>
+          <w:bCs/>
+          <w:szCs w:val="28"/>
+        </w:rPr>
+        <w:t xml:space="preserve"> y los elementos registrados</w:t>
       </w:r>
     </w:p>
     <w:p>
@@ -1005,7 +1082,23 @@
           <w:bCs/>
           <w:szCs w:val="28"/>
         </w:rPr>
-        <w:t xml:space="preserve">Editar la información de las categorias y elementos de una colección </w:t>
+        <w:t xml:space="preserve">Editar la información de las </w:t>
+      </w:r>
+      <w:r>
+        <w:rPr>
+          <w:rFonts w:cstheme="minorHAnsi"/>
+          <w:bCs/>
+          <w:szCs w:val="28"/>
+        </w:rPr>
+        <w:t>categorías</w:t>
+      </w:r>
+      <w:r>
+        <w:rPr>
+          <w:rFonts w:cstheme="minorHAnsi"/>
+          <w:bCs/>
+          <w:szCs w:val="28"/>
+        </w:rPr>
+        <w:t xml:space="preserve"> y elementos de una colección </w:t>
       </w:r>
     </w:p>
     <w:p>
@@ -1027,7 +1120,23 @@
           <w:bCs/>
           <w:szCs w:val="28"/>
         </w:rPr>
-        <w:t>Eliminar elementos o categorias de la colección</w:t>
+        <w:t xml:space="preserve">Eliminar elementos o </w:t>
+      </w:r>
+      <w:r>
+        <w:rPr>
+          <w:rFonts w:cstheme="minorHAnsi"/>
+          <w:bCs/>
+          <w:szCs w:val="28"/>
+        </w:rPr>
+        <w:t>categorías</w:t>
+      </w:r>
+      <w:r>
+        <w:rPr>
+          <w:rFonts w:cstheme="minorHAnsi"/>
+          <w:bCs/>
+          <w:szCs w:val="28"/>
+        </w:rPr>
+        <w:t xml:space="preserve"> de la colección</w:t>
       </w:r>
     </w:p>
     <w:p>
@@ -1071,7 +1180,7 @@
           <w:bCs/>
           <w:szCs w:val="28"/>
         </w:rPr>
-        <w:t>Mostrar cantidad de elementos por categoria</w:t>
+        <w:t xml:space="preserve">Mostrar cantidad de elementos por </w:t>
       </w:r>
       <w:r>
         <w:rPr>
@@ -1079,7 +1188,23 @@
           <w:bCs/>
           <w:szCs w:val="28"/>
         </w:rPr>
-        <w:t>s.</w:t>
+        <w:t>categoría</w:t>
+      </w:r>
+      <w:r>
+        <w:rPr>
+          <w:rFonts w:cstheme="minorHAnsi"/>
+          <w:bCs/>
+          <w:szCs w:val="28"/>
+        </w:rPr>
+        <w:t>s</w:t>
+      </w:r>
+      <w:r>
+        <w:rPr>
+          <w:rFonts w:cstheme="minorHAnsi"/>
+          <w:bCs/>
+          <w:szCs w:val="28"/>
+        </w:rPr>
+        <w:t>.</w:t>
       </w:r>
       <w:r>
         <w:rPr>
@@ -1275,7 +1400,25 @@
           <w:bCs/>
           <w:szCs w:val="28"/>
         </w:rPr>
-        <w:t>Requisito 7 -El sistema debe mostrar el numero de elementos registrados en cada categoría.</w:t>
+        <w:t xml:space="preserve">Requisito 7 -El sistema debe mostrar el </w:t>
+      </w:r>
+      <w:proofErr w:type="spellStart"/>
+      <w:r>
+        <w:rPr>
+          <w:rFonts w:cstheme="minorHAnsi"/>
+          <w:bCs/>
+          <w:szCs w:val="28"/>
+        </w:rPr>
+        <w:t>numero</w:t>
+      </w:r>
+      <w:proofErr w:type="spellEnd"/>
+      <w:r>
+        <w:rPr>
+          <w:rFonts w:cstheme="minorHAnsi"/>
+          <w:bCs/>
+          <w:szCs w:val="28"/>
+        </w:rPr>
+        <w:t xml:space="preserve"> de elementos registrados en cada categoría.</w:t>
       </w:r>
     </w:p>
     <w:p>
@@ -1303,10 +1446,50 @@
         <w:pStyle w:val="Contenido"/>
       </w:pPr>
       <w:r>
-        <w:t>Imagen que contiene el diagrama con sus módulos y relaciones entre módul</w:t>
-      </w:r>
-      <w:r>
-        <w:t>os</w:t>
+        <w:rPr>
+          <w:noProof/>
+        </w:rPr>
+        <w:drawing>
+          <wp:inline distT="0" distB="0" distL="0" distR="0" wp14:anchorId="3D4DCCBF" wp14:editId="1976B371">
+            <wp:extent cx="1733550" cy="4295775"/>
+            <wp:effectExtent l="0" t="0" r="0" b="9525"/>
+            <wp:docPr id="4" name="Imagen 4"/>
+            <wp:cNvGraphicFramePr>
+              <a:graphicFrameLocks xmlns:a="http://schemas.openxmlformats.org/drawingml/2006/main" noChangeAspect="1"/>
+            </wp:cNvGraphicFramePr>
+            <a:graphic xmlns:a="http://schemas.openxmlformats.org/drawingml/2006/main">
+              <a:graphicData uri="http://schemas.openxmlformats.org/drawingml/2006/picture">
+                <pic:pic xmlns:pic="http://schemas.openxmlformats.org/drawingml/2006/picture">
+                  <pic:nvPicPr>
+                    <pic:cNvPr id="4" name="Imagen 4"/>
+                    <pic:cNvPicPr/>
+                  </pic:nvPicPr>
+                  <pic:blipFill>
+                    <a:blip r:embed="rId10">
+                      <a:extLst>
+                        <a:ext uri="{28A0092B-C50C-407E-A947-70E740481C1C}">
+                          <a14:useLocalDpi xmlns:a14="http://schemas.microsoft.com/office/drawing/2010/main" val="0"/>
+                        </a:ext>
+                      </a:extLst>
+                    </a:blip>
+                    <a:stretch>
+                      <a:fillRect/>
+                    </a:stretch>
+                  </pic:blipFill>
+                  <pic:spPr>
+                    <a:xfrm>
+                      <a:off x="0" y="0"/>
+                      <a:ext cx="1733550" cy="4295775"/>
+                    </a:xfrm>
+                    <a:prstGeom prst="rect">
+                      <a:avLst/>
+                    </a:prstGeom>
+                  </pic:spPr>
+                </pic:pic>
+              </a:graphicData>
+            </a:graphic>
+          </wp:inline>
+        </w:drawing>
       </w:r>
     </w:p>
     <w:p>
@@ -1314,9 +1497,6 @@
         <w:pStyle w:val="Ttulo1"/>
       </w:pPr>
       <w:r>
-        <w:rPr>
-          <w:highlight w:val="yellow"/>
-        </w:rPr>
         <w:t>Definición de Roles</w:t>
       </w:r>
     </w:p>
@@ -1333,7 +1513,23 @@
           <w:b/>
           <w:bCs/>
         </w:rPr>
-        <w:t>Producto Owner:</w:t>
+        <w:t xml:space="preserve">Producto </w:t>
+      </w:r>
+      <w:proofErr w:type="spellStart"/>
+      <w:r>
+        <w:rPr>
+          <w:b/>
+          <w:bCs/>
+        </w:rPr>
+        <w:t>Owner</w:t>
+      </w:r>
+      <w:proofErr w:type="spellEnd"/>
+      <w:r>
+        <w:rPr>
+          <w:b/>
+          <w:bCs/>
+        </w:rPr>
+        <w:t>:</w:t>
       </w:r>
       <w:r>
         <w:t xml:space="preserve"> Isaura Alexandra Banguera Ruiz.</w:t>
@@ -1371,7 +1567,23 @@
           <w:b/>
           <w:bCs/>
         </w:rPr>
-        <w:t>Scrum Team:</w:t>
+        <w:t xml:space="preserve">Scrum </w:t>
+      </w:r>
+      <w:proofErr w:type="spellStart"/>
+      <w:r>
+        <w:rPr>
+          <w:b/>
+          <w:bCs/>
+        </w:rPr>
+        <w:t>Team</w:t>
+      </w:r>
+      <w:proofErr w:type="spellEnd"/>
+      <w:r>
+        <w:rPr>
+          <w:b/>
+          <w:bCs/>
+        </w:rPr>
+        <w:t>:</w:t>
       </w:r>
       <w:r>
         <w:rPr>
@@ -1455,12 +1667,21 @@
           <w:numId w:val="1"/>
         </w:numPr>
       </w:pPr>
+      <w:proofErr w:type="spellStart"/>
       <w:r>
         <w:rPr>
           <w:b/>
           <w:bCs/>
         </w:rPr>
-        <w:t>Tester:</w:t>
+        <w:t>Tester</w:t>
+      </w:r>
+      <w:proofErr w:type="spellEnd"/>
+      <w:r>
+        <w:rPr>
+          <w:b/>
+          <w:bCs/>
+        </w:rPr>
+        <w:t>:</w:t>
       </w:r>
       <w:r>
         <w:t xml:space="preserve"> Nathalia Mejia Buitrago.</w:t>
@@ -1493,12 +1714,21 @@
           <w:numId w:val="1"/>
         </w:numPr>
       </w:pPr>
+      <w:proofErr w:type="spellStart"/>
       <w:r>
         <w:rPr>
           <w:b/>
           <w:bCs/>
         </w:rPr>
-        <w:t>Team lead:</w:t>
+        <w:t>Team</w:t>
+      </w:r>
+      <w:proofErr w:type="spellEnd"/>
+      <w:r>
+        <w:rPr>
+          <w:b/>
+          <w:bCs/>
+        </w:rPr>
+        <w:t xml:space="preserve"> lead:</w:t>
       </w:r>
       <w:r>
         <w:t xml:space="preserve"> Nathalia Mejia Buitrago.</w:t>
@@ -1517,7 +1747,23 @@
           <w:b/>
           <w:bCs/>
         </w:rPr>
-        <w:t>Desarrolladores back end:</w:t>
+        <w:t xml:space="preserve">Desarrolladores back </w:t>
+      </w:r>
+      <w:proofErr w:type="spellStart"/>
+      <w:r>
+        <w:rPr>
+          <w:b/>
+          <w:bCs/>
+        </w:rPr>
+        <w:t>end</w:t>
+      </w:r>
+      <w:proofErr w:type="spellEnd"/>
+      <w:r>
+        <w:rPr>
+          <w:b/>
+          <w:bCs/>
+        </w:rPr>
+        <w:t>:</w:t>
       </w:r>
       <w:r>
         <w:t xml:space="preserve"> Nathalia Mejia Buitrago - Isaura Alexandra Banguera Ruiz.</w:t>
@@ -1531,8 +1777,8 @@
           <w:numId w:val="1"/>
         </w:numPr>
         <w:sectPr>
-          <w:headerReference w:type="default" r:id="rId10"/>
-          <w:footerReference w:type="default" r:id="rId11"/>
+          <w:headerReference w:type="default" r:id="rId11"/>
+          <w:footerReference w:type="default" r:id="rId12"/>
           <w:pgSz w:w="11906" w:h="16838" w:code="9"/>
           <w:pgMar w:top="720" w:right="936" w:bottom="720" w:left="936" w:header="0" w:footer="289" w:gutter="0"/>
           <w:pgNumType w:start="1"/>
@@ -1545,17 +1791,41 @@
           <w:b/>
           <w:bCs/>
         </w:rPr>
-        <w:t>Desarrolladores Front End:</w:t>
-      </w:r>
+        <w:t xml:space="preserve">Desarrolladores Front </w:t>
+      </w:r>
+      <w:proofErr w:type="spellStart"/>
       <w:r>
         <w:rPr>
           <w:b/>
           <w:bCs/>
         </w:rPr>
+        <w:t>End</w:t>
+      </w:r>
+      <w:proofErr w:type="spellEnd"/>
+      <w:r>
+        <w:rPr>
+          <w:b/>
+          <w:bCs/>
+        </w:rPr>
+        <w:t>:</w:t>
+      </w:r>
+      <w:r>
+        <w:rPr>
+          <w:b/>
+          <w:bCs/>
+        </w:rPr>
         <w:t xml:space="preserve"> </w:t>
       </w:r>
       <w:r>
-        <w:t>Nathalia Mejia Buitrago  - Isaura Alexandra Banguera Ruiz</w:t>
+        <w:t xml:space="preserve">Nathalia Mejia </w:t>
+      </w:r>
+      <w:proofErr w:type="gramStart"/>
+      <w:r>
+        <w:t>Buitrago  -</w:t>
+      </w:r>
+      <w:proofErr w:type="gramEnd"/>
+      <w:r>
+        <w:t xml:space="preserve"> Isaura Alexandra Banguera Ruiz</w:t>
       </w:r>
     </w:p>
     <w:p>
@@ -2129,13 +2399,7 @@
               <w:cnfStyle w:val="000000100000" w:firstRow="0" w:lastRow="0" w:firstColumn="0" w:lastColumn="0" w:oddVBand="0" w:evenVBand="0" w:oddHBand="1" w:evenHBand="0" w:firstRowFirstColumn="0" w:firstRowLastColumn="0" w:lastRowFirstColumn="0" w:lastRowLastColumn="0"/>
             </w:pPr>
             <w:r>
-              <w:t xml:space="preserve">Editar la colección de un elemento y </w:t>
-            </w:r>
-            <w:r>
-              <w:t>categorías</w:t>
-            </w:r>
-            <w:r>
-              <w:t>.</w:t>
+              <w:t>Editar la colección de un elemento y categorías.</w:t>
             </w:r>
           </w:p>
         </w:tc>
@@ -2596,6 +2860,7 @@
       <w:pPr>
         <w:pStyle w:val="Ttulo1"/>
       </w:pPr>
+      <w:proofErr w:type="spellStart"/>
       <w:r>
         <w:t>Pr</w:t>
       </w:r>
@@ -2603,7 +2868,11 @@
         <w:t>o</w:t>
       </w:r>
       <w:r>
-        <w:t>duct Backlog</w:t>
+        <w:t>duct</w:t>
+      </w:r>
+      <w:proofErr w:type="spellEnd"/>
+      <w:r>
+        <w:t xml:space="preserve"> Backlog</w:t>
       </w:r>
     </w:p>
     <w:p>
@@ -3611,10 +3880,7 @@
               <w:cnfStyle w:val="000000100000" w:firstRow="0" w:lastRow="0" w:firstColumn="0" w:lastColumn="0" w:oddVBand="0" w:evenVBand="0" w:oddHBand="1" w:evenHBand="0" w:firstRowFirstColumn="0" w:firstRowLastColumn="0" w:lastRowFirstColumn="0" w:lastRowLastColumn="0"/>
             </w:pPr>
             <w:r>
-              <w:t xml:space="preserve">Editar información de un elemento y </w:t>
-            </w:r>
-            <w:r>
-              <w:t>categoría.</w:t>
+              <w:t>Editar información de un elemento y categoría.</w:t>
             </w:r>
           </w:p>
         </w:tc>
@@ -4643,8 +4909,8 @@
       <w:pPr>
         <w:pStyle w:val="Contenido"/>
         <w:sectPr>
-          <w:headerReference w:type="default" r:id="rId12"/>
-          <w:footerReference w:type="default" r:id="rId13"/>
+          <w:headerReference w:type="default" r:id="rId13"/>
+          <w:footerReference w:type="default" r:id="rId14"/>
           <w:pgSz w:w="16838" w:h="11906" w:orient="landscape" w:code="9"/>
           <w:pgMar w:top="936" w:right="720" w:bottom="936" w:left="720" w:header="0" w:footer="289" w:gutter="0"/>
           <w:pgNumType w:start="1"/>
@@ -6404,6 +6670,7 @@
   <w:style w:type="character" w:default="1" w:styleId="Fuentedeprrafopredeter">
     <w:name w:val="Default Paragraph Font"/>
     <w:uiPriority w:val="1"/>
+    <w:semiHidden/>
     <w:unhideWhenUsed/>
   </w:style>
   <w:style w:type="table" w:default="1" w:styleId="Tablanormal">
@@ -7062,6 +7329,7 @@
     <w:rsid w:val="002E25B6"/>
     <w:rsid w:val="00327B20"/>
     <w:rsid w:val="00670E68"/>
+    <w:rsid w:val="00671244"/>
     <w:rsid w:val="009B0278"/>
   </w:rsids>
   <m:mathPr>
@@ -7551,9 +7819,6 @@
   <w:style w:type="paragraph" w:customStyle="1" w:styleId="A9B4550B676949FF846EEBBAF789DB52">
     <w:name w:val="A9B4550B676949FF846EEBBAF789DB52"/>
   </w:style>
-  <w:style w:type="paragraph" w:customStyle="1" w:styleId="CEC514602C9C41ABB2694092C63DBD58">
-    <w:name w:val="CEC514602C9C41ABB2694092C63DBD58"/>
-  </w:style>
   <w:style w:type="paragraph" w:customStyle="1" w:styleId="BD9461F4A18B4E2F958D8FD57C3BFE0A">
     <w:name w:val="BD9461F4A18B4E2F958D8FD57C3BFE0A"/>
   </w:style>

</xml_diff>